<commit_message>
repo url added to word file
</commit_message>
<xml_diff>
--- a/docs/Waygood_Candidate_Assignment.docx
+++ b/docs/Waygood_Candidate_Assignment.docx
@@ -23,7 +23,18 @@
       </w:r>
       <w:proofErr w:type="spellEnd"/>
       <w:r>
-        <w:t xml:space="preserve"> repo - </w:t>
+        <w:t xml:space="preserve"> repo </w:t>
+      </w:r>
+      <w:r>
+        <w:t>–</w:t>
+      </w:r>
+      <w:r>
+        <w:t xml:space="preserve"> </w:t>
+      </w:r>
+    </w:p>
+    <w:p>
+      <w:r>
+        <w:t>https://github.com/joginder-swami/backend-assignment-template.git</w:t>
       </w:r>
     </w:p>
     <w:p/>
@@ -42,10 +53,7 @@
     </w:p>
     <w:p>
       <w:r>
-        <w:t xml:space="preserve">The product context is a study-abroad platform where students discover universities, compare programs, and track application </w:t>
-      </w:r>
-      <w:r>
-        <w:t>progress with counselor support.</w:t>
+        <w:t>The product context is a study-abroad platform where students discover universities, compare programs, and track application progress with counselor support.</w:t>
       </w:r>
     </w:p>
     <w:p>
@@ -60,10 +68,7 @@
     </w:p>
     <w:p>
       <w:r>
-        <w:t>The starter project already includes sample entities, seed</w:t>
-      </w:r>
-      <w:r>
-        <w:t>ed data, a React dashboard shell, and a backend code structure with intentional gaps.</w:t>
+        <w:t>The starter project already includes sample entities, seeded data, a React dashboard shell, and a backend code structure with intentional gaps.</w:t>
       </w:r>
     </w:p>
     <w:p>
@@ -78,10 +83,7 @@
     </w:p>
     <w:p>
       <w:r>
-        <w:t>2. Complete advanced university and pro</w:t>
-      </w:r>
-      <w:r>
-        <w:t>gram discovery with filtering, pagination, sorting, and a clean response format.</w:t>
+        <w:t>2. Complete advanced university and program discovery with filtering, pagination, sorting, and a clean response format.</w:t>
       </w:r>
     </w:p>
     <w:p>
@@ -91,10 +93,7 @@
     </w:p>
     <w:p>
       <w:r>
-        <w:t>4. Implement the application workflow, dupli</w:t>
-      </w:r>
-      <w:r>
-        <w:t>cate prevention, valid status transitions, and status history tracking.</w:t>
+        <w:t>4. Implement the application workflow, duplicate prevention, valid status transitions, and status history tracking.</w:t>
       </w:r>
     </w:p>
     <w:p>
@@ -104,10 +103,7 @@
     </w:p>
     <w:p>
       <w:r>
-        <w:t>6. Add tests for important API flows and document assumptions or architecture notes in the REA</w:t>
-      </w:r>
-      <w:r>
-        <w:t>DME.</w:t>
+        <w:t>6. Add tests for important API flows and document assumptions or architecture notes in the README.</w:t>
       </w:r>
     </w:p>
     <w:p>
@@ -117,15 +113,7 @@
     </w:p>
     <w:p>
       <w:r>
-        <w:t xml:space="preserve">Optional ideas include AI-assisted study planning, Docker setup, </w:t>
-      </w:r>
-      <w:proofErr w:type="gramStart"/>
-      <w:r>
-        <w:t>React</w:t>
-      </w:r>
-      <w:proofErr w:type="gramEnd"/>
-      <w:r>
-        <w:t xml:space="preserve"> dashboard improvements, and stronger security or rate limiting.</w:t>
+        <w:t>Optional ideas include AI-assisted study planning, Docker setup, React dashboard improvements, and stronger security or rate limiting.</w:t>
       </w:r>
     </w:p>
     <w:p>
@@ -135,10 +123,7 @@
     </w:p>
     <w:p>
       <w:r>
-        <w:t>We will evaluate API design, MongoDB understanding, aggregation quality, performance th</w:t>
-      </w:r>
-      <w:r>
-        <w:t>inking, maintainability, testing, and how well the solution reflects a real study-abroad workflow.</w:t>
+        <w:t>We will evaluate API design, MongoDB understanding, aggregation quality, performance thinking, maintainability, testing, and how well the solution reflects a real study-abroad workflow.</w:t>
       </w:r>
     </w:p>
     <w:p>
@@ -148,6 +133,7 @@
     </w:p>
     <w:p>
       <w:r>
+        <w:lastRenderedPageBreak/>
         <w:t>Share your repository, setup instructions, environment notes, and any assumptions needed to review your implementation.</w:t>
       </w:r>
     </w:p>

</xml_diff>